<commit_message>
Finish aligning Level 1 demo lesson with RAZ aa Toys words
Co-authored-by: Francis <earthonliner@users.noreply.github.com>
</commit_message>
<xml_diff>
--- a/lesson-plans/demo-lesson-level1-toys.docx
+++ b/lesson-plans/demo-lesson-level1-toys.docx
@@ -447,7 +447,7 @@
                 <w:b w:val="0"/>
                 <w:sz w:val="18"/>
               </w:rPr>
-              <w:t>ball, top（陀螺）, train, truck, drum, puppet（手偶）</w:t>
+              <w:t>ball, top（陀螺）, drum, kite, robot, puppet（手偶）</w:t>
             </w:r>
           </w:p>
         </w:tc>
@@ -465,7 +465,7 @@
                 <w:b w:val="0"/>
                 <w:sz w:val="18"/>
               </w:rPr>
-              <w:t>6 个有实物；Level 1 p.96–97 的 10 词里选最适合道具与 /t/ /p/ 的 6 个；kite, car, bike, game 见到时顺带说</w:t>
+              <w:t>6 个有实物；Level 1 p.96–97、p.100 的词里选与道具、/t/ /p/ 及绘本重合最高的 6 个：drum、kite、robot 三个词同时出现在绘本《Toys》里；train, truck, car, bike, game 见到时顺带说</w:t>
             </w:r>
           </w:p>
         </w:tc>
@@ -503,7 +503,7 @@
                 <w:b w:val="0"/>
                 <w:sz w:val="18"/>
               </w:rPr>
-              <w:t>teddy bear, doll, balloon（Vocabulary 2 / 道具自带）</w:t>
+              <w:t>绘本里的另外 5 个词 blocks, bear, paint, plane, wagon；道具自带的 teddy bear, balloon</w:t>
             </w:r>
           </w:p>
         </w:tc>
@@ -521,7 +521,7 @@
                 <w:b w:val="0"/>
                 <w:sz w:val="18"/>
               </w:rPr>
-              <w:t>不考</w:t>
+              <w:t>老师读、孩子指图即可，不考</w:t>
             </w:r>
           </w:p>
         </w:tc>
@@ -783,7 +783,7 @@
                 <w:b w:val="0"/>
                 <w:sz w:val="18"/>
               </w:rPr>
-              <w:t>RAZ aa《Toys》："The ___."</w:t>
+              <w:t>RAZ aa《Toys》8 页：the blocks, the bear, the paint, the drum, the plane, the wagon, the kite, the robot</w:t>
             </w:r>
           </w:p>
         </w:tc>
@@ -801,7 +801,7 @@
                 <w:b w:val="0"/>
                 <w:sz w:val="18"/>
               </w:rPr>
-              <w:t>认 the；指读；找 /t/ /p/ 开头的玩具</w:t>
+              <w:t>认 the；指读；drum / kite / robot 三页孩子独立读出；找 /p/ 开头的词（paint, plane）</w:t>
             </w:r>
           </w:p>
         </w:tc>
@@ -1007,7 +1007,7 @@
                 <w:b w:val="0"/>
                 <w:sz w:val="17"/>
               </w:rPr>
-              <w:t>玩具小火车 ×1、小卡车 ×1</w:t>
+              <w:t>小鼓或拨浪鼓 ×1</w:t>
             </w:r>
           </w:p>
           <w:p>
@@ -1019,7 +1019,19 @@
                 <w:b w:val="0"/>
                 <w:sz w:val="17"/>
               </w:rPr>
-              <w:t>小鼓或拨浪鼓 ×1</w:t>
+              <w:t>小风筝 ×1（迷你风筝或卡纸风筝）</w:t>
+            </w:r>
+          </w:p>
+          <w:p>
+            <w:pPr>
+              <w:spacing w:after="0" w:line="252" w:lineRule="auto"/>
+            </w:pPr>
+            <w:r>
+              <w:rPr>
+                <w:b w:val="0"/>
+                <w:sz w:val="17"/>
+              </w:rPr>
+              <w:t>玩具机器人 ×1</w:t>
             </w:r>
           </w:p>
           <w:p>
@@ -1508,7 +1520,7 @@
                 <w:b w:val="0"/>
                 <w:sz w:val="17"/>
               </w:rPr>
-              <w:t>ball, top, train, truck, drum, puppet</w:t>
+              <w:t>ball, top, drum, kite, robot, puppet</w:t>
             </w:r>
           </w:p>
         </w:tc>
@@ -2599,7 +2611,7 @@
                 <w:b w:val="0"/>
                 <w:sz w:val="17"/>
               </w:rPr>
-              <w:t>① 举起玩具 "A train!" ×3（第 3 遍夸张口型）② "Say it with me: train, train, train."（拍手）③ 悄悄话 / 大声 / 机器人声 ④ 递给一个孩子 "What is it?" 答后传下去</w:t>
+              <w:t>① 举起玩具 "A drum!" ×3（第 3 遍夸张口型）② "Say it with me: drum, drum, drum."（拍手）③ 悄悄话 / 大声 / 机器人声 ④ 递给一个孩子 "What is it?" 答后传下去</w:t>
             </w:r>
           </w:p>
         </w:tc>
@@ -2636,7 +2648,7 @@
                 <w:color w:val="8A5A00"/>
                 <w:sz w:val="17"/>
               </w:rPr>
-              <w:t>※ 顺序：ball → top（转一下，尖叫）→ train → truck（train/truck 放一起对比首音 /t/，顺便埋伏笔）→ drum（敲一下）→ puppet（举起 Bobo："Bobo is a puppet!"）</w:t>
+              <w:t>※ 顺序：ball → top（转一下，尖叫；/t/ 伏笔）→ drum（敲一下）→ kite（举高放风筝）→ robot（机器人走路）→ puppet（举起 Bobo："Bobo is a puppet!"；/p/ 伏笔）</w:t>
             </w:r>
           </w:p>
         </w:tc>
@@ -3013,7 +3025,7 @@
                 <w:b w:val="0"/>
                 <w:sz w:val="17"/>
               </w:rPr>
-              <w:t>Bobo 举玩具问全班 "Do you want a truck?" 全班按真实想法答 Yes, I do! 或 No, I don't.；老师数人数 "Three yes, four no!" 6 轮</w:t>
+              <w:t>Bobo 举玩具问全班 "Do you want a robot?" 全班按真实想法答 Yes, I do! 或 No, I don't.；老师数人数 "Three yes, four no!" 6 轮</w:t>
             </w:r>
           </w:p>
         </w:tc>
@@ -3352,7 +3364,7 @@
                 <w:b w:val="0"/>
                 <w:sz w:val="17"/>
               </w:rPr>
-              <w:t>揭开 Tt："Name?"（孩子：tee）"Sound: /t/ /t/ /t/."（手指唇前感受气流）"top—/t/, train—/t/, truck—/t/!" 揭开 Pp："Name: P. Sound: /p/ /p/ /p/." "puppet—/p/, pop—/p/!" 每个音孩子跟说 5 遍</w:t>
+              <w:t>揭开 Tt："Name?"（孩子：tee）"Sound: /t/ /t/ /t/."（手指唇前感受气流）"top—/t/, teddy—/t/, ten—/t/!"（举 10 根手指） 揭开 Pp："Name: P. Sound: /p/ /p/ /p/." "puppet—/p/, pop—/p/!" 每个音孩子跟说 5 遍</w:t>
             </w:r>
           </w:p>
         </w:tc>
@@ -3929,7 +3941,7 @@
                 <w:b w:val="0"/>
                 <w:sz w:val="17"/>
               </w:rPr>
-              <w:t>逐页指读 "The… ball." 第 2 遍读 "The…" 停住让孩子接词</w:t>
+              <w:t>逐页指读 "The… blocks." 第 2 遍读 "The…" 停住：drum / kite / robot 三页让孩子接词；blocks, bear, paint, plane, wagon 五页老师读出并配动作（搭积木、抱熊、刷油漆、飞机飞、拉车）</w:t>
             </w:r>
           </w:p>
         </w:tc>
@@ -3947,7 +3959,7 @@
                 <w:b w:val="0"/>
                 <w:sz w:val="17"/>
               </w:rPr>
-              <w:t>接词</w:t>
+              <w:t>接词：drum! kite! robot!；其他页跟做动作</w:t>
             </w:r>
           </w:p>
         </w:tc>
@@ -3966,7 +3978,7 @@
                 <w:color w:val="8A5A00"/>
                 <w:sz w:val="17"/>
               </w:rPr>
-              <w:t>※ 未学词老师直接读出</w:t>
+              <w:t>※ 那 5 个词不教不考，只"听懂并指"——分级读物本来就该有课堂之外的词</w:t>
             </w:r>
           </w:p>
         </w:tc>
@@ -4004,7 +4016,7 @@
                 <w:b w:val="0"/>
                 <w:sz w:val="17"/>
               </w:rPr>
-              <w:t>举 the 词卡："This little word is the." 每页找 the；再 "Find /t/ toys!"（truck, top, teddy）"Find /p/ toys!"（puppet）贴星星</w:t>
+              <w:t>举 the 词卡："This little word is the." 每页找 the；再 "Find /p/ words!"（paint, plane——老师读这两页时故意重读 /p/）"Is there a top in the book? No! So we make our own page!"（引出下一步写 The top.）贴星星</w:t>
             </w:r>
           </w:p>
         </w:tc>
@@ -4022,7 +4034,7 @@
                 <w:b w:val="0"/>
                 <w:sz w:val="17"/>
               </w:rPr>
-              <w:t>指 the ×6；找词说首音</w:t>
+              <w:t>指 the ×8；找 /p/ 词</w:t>
             </w:r>
           </w:p>
         </w:tc>
@@ -4191,7 +4203,7 @@
                 <w:color w:val="8A5A00"/>
                 <w:sz w:val="17"/>
               </w:rPr>
-              <w:t>※ 6 岁只要求描 + 抄，不要求记忆拼写；写完让孩子用手指读自己写的句子 "The top."——他在读自己写的字</w:t>
+              <w:t>※ 6 岁只要求描 + 抄，不要求记忆拼写；写完让孩子用手指读自己写的句子 "The top."——他在读自己写的字。把这张卡夹进《Toys》最后一页，就成了这本书的"第 9 页"，回家读书时一起读</w:t>
             </w:r>
           </w:p>
         </w:tc>
@@ -4418,7 +4430,7 @@
                 <w:b w:val="0"/>
                 <w:sz w:val="17"/>
               </w:rPr>
-              <w:t>每人 30 秒：翻到任一页读 "The ___."；举自己的卡读 "The top."；举陀螺。全班齐喊 "You can read!" 发贴纸贴到奖状卡</w:t>
+              <w:t>每人 30 秒：翻到 drum / kite / robot 任一页读 "The ___."；举自己的卡读 "The top."；举陀螺。全班齐喊 "You can read!" 发贴纸贴到奖状卡</w:t>
             </w:r>
           </w:p>
         </w:tc>
@@ -4804,6 +4816,72 @@
         <w:spacing w:after="40"/>
       </w:pPr>
     </w:p>
+    <w:tbl>
+      <w:tblPr>
+        <w:tblStyle w:val="TableGrid"/>
+        <w:tblW w:type="auto" w:w="0"/>
+        <w:tblLook w:firstColumn="1" w:firstRow="1" w:lastColumn="0" w:lastRow="0" w:noHBand="0" w:noVBand="1" w:val="04A0"/>
+      </w:tblPr>
+      <w:tblGrid>
+        <w:gridCol w:w="9978"/>
+      </w:tblGrid>
+      <w:tr>
+        <w:tc>
+          <w:tcPr>
+            <w:tcW w:type="dxa" w:w="9978"/>
+            <w:shd w:val="clear" w:color="auto" w:fill="FFF9E6"/>
+          </w:tcPr>
+          <w:p>
+            <w:r/>
+            <w:r>
+              <w:rPr>
+                <w:b/>
+                <w:sz w:val="20"/>
+              </w:rPr>
+              <w:t>关于绘本《Toys》与课堂词的重合度</w:t>
+            </w:r>
+          </w:p>
+          <w:p>
+            <w:pPr>
+              <w:spacing w:after="20"/>
+            </w:pPr>
+            <w:r>
+              <w:rPr>
+                <w:sz w:val="19"/>
+              </w:rPr>
+              <w:t>《Toys》8 页：the blocks, the bear, the paint, the drum, the plane, the wagon, the kite, the robot。与本课 6 个核心词重合 3 个（drum, kite, robot），核心词已按绘本调整（去掉 train、truck）。</w:t>
+            </w:r>
+          </w:p>
+          <w:p>
+            <w:pPr>
+              <w:spacing w:after="20"/>
+            </w:pPr>
+            <w:r>
+              <w:rPr>
+                <w:sz w:val="19"/>
+              </w:rPr>
+              <w:t>其余 5 个词：老师读 + 动作，孩子听懂并指图，不说不考。拼读目标词 top 不在书里，正好用"书里没有 top，我们自己写一页"引出书写环节，并把写好的卡片夹进书里当第 9 页。</w:t>
+            </w:r>
+          </w:p>
+          <w:p>
+            <w:pPr>
+              <w:spacing w:after="20"/>
+            </w:pPr>
+            <w:r>
+              <w:rPr>
+                <w:sz w:val="19"/>
+              </w:rPr>
+              <w:t>为什么不换书：RAZ aa 级以玩具为主题的只有这一本，其他 aa 书话题对不上道具。下学期 U6 正式上玩具单元时，可用班级自制小书《Our Toys》补足 ball, top, puppet 等词的朗读材料。</w:t>
+            </w:r>
+          </w:p>
+        </w:tc>
+      </w:tr>
+    </w:tbl>
+    <w:p>
+      <w:pPr>
+        <w:spacing w:after="40"/>
+      </w:pPr>
+    </w:p>
     <w:p>
       <w:pPr>
         <w:spacing w:before="240" w:after="80"/>
@@ -4983,7 +5061,7 @@
                 <w:b w:val="0"/>
                 <w:sz w:val="18"/>
               </w:rPr>
-              <w:t>当店员问句；拼读 pot、hop（加 h 卡）；绘本多读一页；写卡时多抄一句 "The ball."</w:t>
+              <w:t>当店员问句；拼读 pot、hop（加 h 卡）；绘本多读一页（可挑战读 bear、blocks）；写卡时多抄一句 "The ball."</w:t>
             </w:r>
           </w:p>
         </w:tc>
@@ -5163,7 +5241,7 @@
         <w:rPr>
           <w:sz w:val="19"/>
         </w:rPr>
-        <w:t>今天学了：ball, top, train, truck, drum, puppet；对话 Do you want a ___? Yes, I do. / No, I don't. I want a ___.；字母声音 t /t/、p /p/、o /o/；拼读 top, pop, pot；绘本《Toys》；书写 The top.</w:t>
+        <w:t>今天学了：ball, top, drum, kite, robot, puppet；对话 Do you want a ___? Yes, I do. / No, I don't. I want a ___.；字母声音 t /t/、p /p/、o /o/；拼读 top, pop, pot；绘本《Toys》；书写 The top.</w:t>
       </w:r>
     </w:p>
     <w:p>

</xml_diff>

<commit_message>
Demo lessons: add 7-minute placement probes to opening, rename puppet to Momo
Co-authored-by: Francis <earthonliner@users.noreply.github.com>
</commit_message>
<xml_diff>
--- a/lesson-plans/demo-lesson-level1-toys.docx
+++ b/lesson-plans/demo-lesson-level1-toys.docx
@@ -953,7 +953,7 @@
                 <w:b w:val="0"/>
                 <w:sz w:val="17"/>
               </w:rPr>
-              <w:t>手套玩偶 Bobo（今天它是玩具店老板，也是 puppet 这个词的实物）</w:t>
+              <w:t>手套玩偶 Momo（今天它是玩具店老板，也是 puppet 这个词的实物）</w:t>
             </w:r>
           </w:p>
           <w:p>
@@ -978,6 +978,18 @@
                 <w:sz w:val="17"/>
               </w:rPr>
               <w:t>贴纸</w:t>
+            </w:r>
+          </w:p>
+          <w:p>
+            <w:pPr>
+              <w:spacing w:after="0" w:line="252" w:lineRule="auto"/>
+            </w:pPr>
+            <w:r>
+              <w:rPr>
+                <w:b w:val="0"/>
+                <w:sz w:val="17"/>
+              </w:rPr>
+              <w:t>开场探针用：图卡 4 张（apple, cat, dog, ball）、字母卡 s / t、词卡 cat、分级观察表 1 张</w:t>
             </w:r>
           </w:p>
         </w:tc>
@@ -1218,7 +1230,7 @@
         <w:rPr>
           <w:sz w:val="19"/>
         </w:rPr>
-        <w:t>地垫半圆 + 家长后排两侧。前方一张矮桌布置成 Toy Shop：铺桌布，摆 6 个玩具（上课前用布盖住），放收银盒和纸币；Bobo 坐在收银盒后面。</w:t>
+        <w:t>地垫半圆 + 家长后排两侧。前方一张矮桌布置成 Toy Shop：铺桌布，摆 6 个玩具（上课前用布盖住），放收银盒和纸币；Momo 坐在收银盒后面。</w:t>
       </w:r>
     </w:p>
     <w:p>
@@ -1392,7 +1404,7 @@
                 <w:b w:val="0"/>
                 <w:sz w:val="17"/>
               </w:rPr>
-              <w:t>0–5</w:t>
+              <w:t>0–7</w:t>
             </w:r>
           </w:p>
         </w:tc>
@@ -1410,7 +1422,7 @@
                 <w:b w:val="0"/>
                 <w:sz w:val="17"/>
               </w:rPr>
-              <w:t>① Hello！名字与年龄</w:t>
+              <w:t>① Hello Momo！问候 + 分级探针</w:t>
             </w:r>
           </w:p>
         </w:tc>
@@ -1428,7 +1440,7 @@
                 <w:b w:val="0"/>
                 <w:sz w:val="17"/>
               </w:rPr>
-              <w:t>I'm ___. I'm six.</w:t>
+              <w:t>I'm ___. I'm six. Yes/No；听指令</w:t>
             </w:r>
           </w:p>
         </w:tc>
@@ -1446,7 +1458,7 @@
                 <w:b w:val="0"/>
                 <w:sz w:val="17"/>
               </w:rPr>
-              <w:t>Bobo</w:t>
+              <w:t>Momo、4 张图卡、字母卡 s t、观察表</w:t>
             </w:r>
           </w:p>
         </w:tc>
@@ -1464,7 +1476,7 @@
                 <w:b w:val="0"/>
                 <w:sz w:val="17"/>
               </w:rPr>
-              <w:t>每人答 1 次</w:t>
+              <w:t>每人被 Momo 问 3 句；6 个探针形成观察表</w:t>
             </w:r>
           </w:p>
         </w:tc>
@@ -1484,7 +1496,7 @@
                 <w:b w:val="0"/>
                 <w:sz w:val="17"/>
               </w:rPr>
-              <w:t>5–15</w:t>
+              <w:t>7–15</w:t>
             </w:r>
           </w:p>
         </w:tc>
@@ -1630,7 +1642,7 @@
                 <w:b w:val="0"/>
                 <w:sz w:val="17"/>
               </w:rPr>
-              <w:t>玩具店、纸币、Bobo</w:t>
+              <w:t>玩具店、纸币、Momo</w:t>
             </w:r>
           </w:p>
         </w:tc>
@@ -2067,7 +2079,21 @@
           <w:color w:val="C0504D"/>
           <w:sz w:val="24"/>
         </w:rPr>
-        <w:t>① Hello！名字与年龄（0–5 分钟）</w:t>
+        <w:t>① Hello Momo！问候 + 7 分钟分级探针（0–7 分钟）</w:t>
+      </w:r>
+    </w:p>
+    <w:p>
+      <w:pPr>
+        <w:spacing w:after="60" w:before="0"/>
+      </w:pPr>
+      <w:r>
+        <w:rPr>
+          <w:b w:val="0"/>
+          <w:i w:val="0"/>
+          <w:color w:val="444444"/>
+          <w:sz w:val="19"/>
+        </w:rPr>
+        <w:t>设计思路：开场仍然是"打招呼 + 常规"，孩子和家长感受到的是热身游戏；但每一步都是一个难度递增的"探针"，7 分钟结束时老师手里有一张每个孩子的观察表，据此决定今天走 A 还是 B 路线（见本节末"分级观察表"）。探针全部由 Momo 发问，答不出就立刻由 Momo 示范兜底，孩子不会有挫败感。</w:t>
       </w:r>
     </w:p>
     <w:tbl>
@@ -2100,7 +2126,7 @@
             <w:r>
               <w:rPr>
                 <w:b/>
-                <w:sz w:val="17"/>
+                <w:sz w:val="16"/>
               </w:rPr>
               <w:t>步骤</w:t>
             </w:r>
@@ -2108,7 +2134,7 @@
         </w:tc>
         <w:tc>
           <w:tcPr>
-            <w:tcW w:type="dxa" w:w="4195"/>
+            <w:tcW w:type="dxa" w:w="3855"/>
             <w:shd w:val="clear" w:color="auto" w:fill="DCE6F1"/>
           </w:tcPr>
           <w:p>
@@ -2119,15 +2145,15 @@
             <w:r>
               <w:rPr>
                 <w:b/>
-                <w:sz w:val="17"/>
-              </w:rPr>
-              <w:t>T 老师</w:t>
+                <w:sz w:val="16"/>
+              </w:rPr>
+              <w:t>T 老师 / Momo</w:t>
             </w:r>
           </w:p>
         </w:tc>
         <w:tc>
           <w:tcPr>
-            <w:tcW w:type="dxa" w:w="2268"/>
+            <w:tcW w:type="dxa" w:w="2041"/>
             <w:shd w:val="clear" w:color="auto" w:fill="DCE6F1"/>
           </w:tcPr>
           <w:p>
@@ -2138,7 +2164,7 @@
             <w:r>
               <w:rPr>
                 <w:b/>
-                <w:sz w:val="17"/>
+                <w:sz w:val="16"/>
               </w:rPr>
               <w:t>S 孩子</w:t>
             </w:r>
@@ -2146,7 +2172,7 @@
         </w:tc>
         <w:tc>
           <w:tcPr>
-            <w:tcW w:type="dxa" w:w="1928"/>
+            <w:tcW w:type="dxa" w:w="2608"/>
             <w:shd w:val="clear" w:color="auto" w:fill="DCE6F1"/>
           </w:tcPr>
           <w:p>
@@ -2158,9 +2184,9 @@
               <w:rPr>
                 <w:b/>
                 <w:color w:val="8A5A00"/>
-                <w:sz w:val="17"/>
-              </w:rPr>
-              <w:t>※ 备注</w:t>
+                <w:sz w:val="16"/>
+              </w:rPr>
+              <w:t>※ 探什么 · 怎么看</w:t>
             </w:r>
           </w:p>
         </w:tc>
@@ -2178,15 +2204,15 @@
             <w:r>
               <w:rPr>
                 <w:b w:val="0"/>
-                <w:sz w:val="17"/>
-              </w:rPr>
-              <w:t>1. 进场（1')</w:t>
+                <w:sz w:val="16"/>
+              </w:rPr>
+              <w:t>1. 进场击掌（1')</w:t>
             </w:r>
           </w:p>
         </w:tc>
         <w:tc>
           <w:tcPr>
-            <w:tcW w:type="dxa" w:w="4195"/>
+            <w:tcW w:type="dxa" w:w="3855"/>
           </w:tcPr>
           <w:p>
             <w:pPr>
@@ -2196,15 +2222,15 @@
             <w:r>
               <w:rPr>
                 <w:b w:val="0"/>
-                <w:sz w:val="17"/>
-              </w:rPr>
-              <w:t>Hello Song；击掌 "Hello!"</w:t>
+                <w:sz w:val="16"/>
+              </w:rPr>
+              <w:t>放 Hello Song；老师与每个孩子击掌 "Hello!" 之后紧接一句 "How are you?"（竖大拇指）</w:t>
             </w:r>
           </w:p>
         </w:tc>
         <w:tc>
           <w:tcPr>
-            <w:tcW w:type="dxa" w:w="2268"/>
+            <w:tcW w:type="dxa" w:w="2041"/>
           </w:tcPr>
           <w:p>
             <w:pPr>
@@ -2214,15 +2240,15 @@
             <w:r>
               <w:rPr>
                 <w:b w:val="0"/>
-                <w:sz w:val="17"/>
-              </w:rPr>
-              <w:t>Hello!</w:t>
+                <w:sz w:val="16"/>
+              </w:rPr>
+              <w:t>Hello! / I'm fine / good（任何回应都算）</w:t>
             </w:r>
           </w:p>
         </w:tc>
         <w:tc>
           <w:tcPr>
-            <w:tcW w:type="dxa" w:w="1928"/>
+            <w:tcW w:type="dxa" w:w="2608"/>
           </w:tcPr>
           <w:p>
             <w:pPr>
@@ -2232,9 +2258,10 @@
             <w:r>
               <w:rPr>
                 <w:b w:val="0"/>
-                <w:sz w:val="17"/>
-              </w:rPr>
-              <w:t>—</w:t>
+                <w:color w:val="8A5A00"/>
+                <w:sz w:val="16"/>
+              </w:rPr>
+              <w:t>※ 探针 0：是否敢开口、是否听过 How are you。只看反应，不计分</w:t>
             </w:r>
           </w:p>
         </w:tc>
@@ -2252,15 +2279,15 @@
             <w:r>
               <w:rPr>
                 <w:b w:val="0"/>
-                <w:sz w:val="17"/>
-              </w:rPr>
-              <w:t>2. Bobo 问候（3')</w:t>
+                <w:sz w:val="16"/>
+              </w:rPr>
+              <w:t>2. Momo 一对一问候（2')</w:t>
             </w:r>
           </w:p>
         </w:tc>
         <w:tc>
           <w:tcPr>
-            <w:tcW w:type="dxa" w:w="4195"/>
+            <w:tcW w:type="dxa" w:w="3855"/>
           </w:tcPr>
           <w:p>
             <w:pPr>
@@ -2270,15 +2297,51 @@
             <w:r>
               <w:rPr>
                 <w:b w:val="0"/>
-                <w:sz w:val="17"/>
-              </w:rPr>
-              <w:t>Bobo（手偶）："Hello! I'm Bobo. What's your name?" → "How old are you?"（伸手指示范 six）</w:t>
+                <w:sz w:val="16"/>
+              </w:rPr>
+              <w:t>Momo 走到每个孩子面前，问三连：</w:t>
+            </w:r>
+          </w:p>
+          <w:p>
+            <w:pPr>
+              <w:spacing w:after="0" w:line="252" w:lineRule="auto"/>
+            </w:pPr>
+            <w:r>
+              <w:rPr>
+                <w:b w:val="0"/>
+                <w:sz w:val="16"/>
+              </w:rPr>
+              <w:t>① "Hello! What's your name?"</w:t>
+            </w:r>
+          </w:p>
+          <w:p>
+            <w:pPr>
+              <w:spacing w:after="0" w:line="252" w:lineRule="auto"/>
+            </w:pPr>
+            <w:r>
+              <w:rPr>
+                <w:b w:val="0"/>
+                <w:sz w:val="16"/>
+              </w:rPr>
+              <w:t>② "How old are you?"（举手指）</w:t>
+            </w:r>
+          </w:p>
+          <w:p>
+            <w:pPr>
+              <w:spacing w:after="0" w:line="252" w:lineRule="auto"/>
+            </w:pPr>
+            <w:r>
+              <w:rPr>
+                <w:b w:val="0"/>
+                <w:sz w:val="16"/>
+              </w:rPr>
+              <w:t>③ 追问一句（二选一随机）："Do you like ice cream?"（舔手势）或 "What colour is this?"（指孩子衣服 / 一个气球）</w:t>
             </w:r>
           </w:p>
         </w:tc>
         <w:tc>
           <w:tcPr>
-            <w:tcW w:type="dxa" w:w="2268"/>
+            <w:tcW w:type="dxa" w:w="2041"/>
           </w:tcPr>
           <w:p>
             <w:pPr>
@@ -2288,15 +2351,39 @@
             <w:r>
               <w:rPr>
                 <w:b w:val="0"/>
-                <w:sz w:val="17"/>
-              </w:rPr>
-              <w:t>I'm ___. I'm six.</w:t>
+                <w:sz w:val="16"/>
+              </w:rPr>
+              <w:t>① I'm ___. / 只说名字</w:t>
+            </w:r>
+          </w:p>
+          <w:p>
+            <w:pPr>
+              <w:spacing w:after="0" w:line="252" w:lineRule="auto"/>
+            </w:pPr>
+            <w:r>
+              <w:rPr>
+                <w:b w:val="0"/>
+                <w:sz w:val="16"/>
+              </w:rPr>
+              <w:t>② I'm six. / Six. / 举手指</w:t>
+            </w:r>
+          </w:p>
+          <w:p>
+            <w:pPr>
+              <w:spacing w:after="0" w:line="252" w:lineRule="auto"/>
+            </w:pPr>
+            <w:r>
+              <w:rPr>
+                <w:b w:val="0"/>
+                <w:sz w:val="16"/>
+              </w:rPr>
+              <w:t>③ Yes! / No! / Red!</w:t>
             </w:r>
           </w:p>
         </w:tc>
         <w:tc>
           <w:tcPr>
-            <w:tcW w:type="dxa" w:w="1928"/>
+            <w:tcW w:type="dxa" w:w="2608"/>
           </w:tcPr>
           <w:p>
             <w:pPr>
@@ -2307,9 +2394,22 @@
               <w:rPr>
                 <w:b w:val="0"/>
                 <w:color w:val="8A5A00"/>
-                <w:sz w:val="17"/>
-              </w:rPr>
-              <w:t>※ 比 Starter 版多一问 How old are you?，6 岁孩子都能答 six，开场就有成功感。答不出的，Bobo 举 6 根手指提示</w:t>
+                <w:sz w:val="16"/>
+              </w:rPr>
+              <w:t>※ 探针 1–3：①② 几乎人人能过，是热身；③ 才是分水岭——没上过课的孩子对 Do you like / What colour 没有反应，上过课的会答 Yes/No 或颜色词。</w:t>
+            </w:r>
+          </w:p>
+          <w:p>
+            <w:pPr>
+              <w:spacing w:after="0" w:line="252" w:lineRule="auto"/>
+            </w:pPr>
+            <w:r>
+              <w:rPr>
+                <w:b w:val="0"/>
+                <w:color w:val="8A5A00"/>
+                <w:sz w:val="16"/>
+              </w:rPr>
+              <w:t>※ 答不出 2 秒内 Momo 自答 "I like ice cream! Yum!" 顺势带过</w:t>
             </w:r>
           </w:p>
         </w:tc>
@@ -2327,15 +2427,15 @@
             <w:r>
               <w:rPr>
                 <w:b w:val="0"/>
-                <w:sz w:val="17"/>
-              </w:rPr>
-              <w:t>3. 常规（1')</w:t>
+                <w:sz w:val="16"/>
+              </w:rPr>
+              <w:t>3. Momo says 听指令（1.5')</w:t>
             </w:r>
           </w:p>
         </w:tc>
         <w:tc>
           <w:tcPr>
-            <w:tcW w:type="dxa" w:w="4195"/>
+            <w:tcW w:type="dxa" w:w="3855"/>
           </w:tcPr>
           <w:p>
             <w:pPr>
@@ -2345,15 +2445,15 @@
             <w:r>
               <w:rPr>
                 <w:b w:val="0"/>
-                <w:sz w:val="17"/>
-              </w:rPr>
-              <w:t>"Stand up / Sit down / Hands up" 3 轮加速；"Hands up = I want to talk."（中文说一次）</w:t>
+                <w:sz w:val="16"/>
+              </w:rPr>
+              <w:t>"Momo says: Stand up! Sit down! Hands up!" 各 2 轮做示范动作；第 3 轮老师不做动作只说，并混入两条没示范过的："Touch your nose!" "Clap three times!"</w:t>
             </w:r>
           </w:p>
         </w:tc>
         <w:tc>
           <w:tcPr>
-            <w:tcW w:type="dxa" w:w="2268"/>
+            <w:tcW w:type="dxa" w:w="2041"/>
           </w:tcPr>
           <w:p>
             <w:pPr>
@@ -2363,15 +2463,15 @@
             <w:r>
               <w:rPr>
                 <w:b w:val="0"/>
-                <w:sz w:val="17"/>
-              </w:rPr>
-              <w:t>跟做</w:t>
+                <w:sz w:val="16"/>
+              </w:rPr>
+              <w:t>跟做；第 3 轮看谁能只凭听做对</w:t>
             </w:r>
           </w:p>
         </w:tc>
         <w:tc>
           <w:tcPr>
-            <w:tcW w:type="dxa" w:w="1928"/>
+            <w:tcW w:type="dxa" w:w="2608"/>
           </w:tcPr>
           <w:p>
             <w:pPr>
@@ -2382,9 +2482,1125 @@
               <w:rPr>
                 <w:b w:val="0"/>
                 <w:color w:val="8A5A00"/>
+                <w:sz w:val="16"/>
+              </w:rPr>
+              <w:t>※ 探针 4：听力理解是否超出"看老师模仿"。只凭声音做对 touch your nose / clap three times 的孩子，听力输入量明显更多。</w:t>
+            </w:r>
+          </w:p>
+          <w:p>
+            <w:pPr>
+              <w:spacing w:after="0" w:line="252" w:lineRule="auto"/>
+            </w:pPr>
+            <w:r>
+              <w:rPr>
+                <w:b w:val="0"/>
+                <w:color w:val="8A5A00"/>
+                <w:sz w:val="16"/>
+              </w:rPr>
+              <w:t>※ 结尾加规则 "Hands up = I want to talk."（中文说一次，全课唯一中文规则）</w:t>
+            </w:r>
+          </w:p>
+        </w:tc>
+      </w:tr>
+      <w:tr>
+        <w:tc>
+          <w:tcPr>
+            <w:tcW w:type="dxa" w:w="1474"/>
+          </w:tcPr>
+          <w:p>
+            <w:pPr>
+              <w:spacing w:after="0" w:line="252" w:lineRule="auto"/>
+            </w:pPr>
+            <w:r/>
+            <w:r>
+              <w:rPr>
+                <w:b w:val="0"/>
+                <w:sz w:val="16"/>
+              </w:rPr>
+              <w:t>4. Momo 的口袋（1.5')</w:t>
+            </w:r>
+          </w:p>
+        </w:tc>
+        <w:tc>
+          <w:tcPr>
+            <w:tcW w:type="dxa" w:w="3855"/>
+          </w:tcPr>
+          <w:p>
+            <w:pPr>
+              <w:spacing w:after="0" w:line="252" w:lineRule="auto"/>
+            </w:pPr>
+            <w:r/>
+            <w:r>
+              <w:rPr>
+                <w:b w:val="0"/>
+                <w:sz w:val="16"/>
+              </w:rPr>
+              <w:t>Momo 身上挂一个小袋，掏出 4 张图卡（apple, cat, dog, ball——都是幼儿园最可能学过的词），每张先问全班 "What is it?" 再快速指 2 个孩子各答 1 张</w:t>
+            </w:r>
+          </w:p>
+        </w:tc>
+        <w:tc>
+          <w:tcPr>
+            <w:tcW w:type="dxa" w:w="2041"/>
+          </w:tcPr>
+          <w:p>
+            <w:pPr>
+              <w:spacing w:after="0" w:line="252" w:lineRule="auto"/>
+            </w:pPr>
+            <w:r/>
+            <w:r>
+              <w:rPr>
+                <w:b w:val="0"/>
+                <w:sz w:val="16"/>
+              </w:rPr>
+              <w:t>齐答 + 个别答（词或 It's a ___.）</w:t>
+            </w:r>
+          </w:p>
+        </w:tc>
+        <w:tc>
+          <w:tcPr>
+            <w:tcW w:type="dxa" w:w="2608"/>
+          </w:tcPr>
+          <w:p>
+            <w:pPr>
+              <w:spacing w:after="0" w:line="252" w:lineRule="auto"/>
+            </w:pPr>
+            <w:r/>
+            <w:r>
+              <w:rPr>
+                <w:b w:val="0"/>
+                <w:color w:val="8A5A00"/>
+                <w:sz w:val="16"/>
+              </w:rPr>
+              <w:t>※ 探针 5：词汇存量 + 是否会用句子。齐答时听"有多少声音"；个别答看是说词还是整句。4 张卡 8 人次，每人至少被点 1 次</w:t>
+            </w:r>
+          </w:p>
+        </w:tc>
+      </w:tr>
+      <w:tr>
+        <w:tc>
+          <w:tcPr>
+            <w:tcW w:type="dxa" w:w="1474"/>
+          </w:tcPr>
+          <w:p>
+            <w:pPr>
+              <w:spacing w:after="0" w:line="252" w:lineRule="auto"/>
+            </w:pPr>
+            <w:r/>
+            <w:r>
+              <w:rPr>
+                <w:b w:val="0"/>
+                <w:sz w:val="16"/>
+              </w:rPr>
+              <w:t>5. 字母的秘密（1')</w:t>
+            </w:r>
+          </w:p>
+        </w:tc>
+        <w:tc>
+          <w:tcPr>
+            <w:tcW w:type="dxa" w:w="3855"/>
+          </w:tcPr>
+          <w:p>
+            <w:pPr>
+              <w:spacing w:after="0" w:line="252" w:lineRule="auto"/>
+            </w:pPr>
+            <w:r/>
+            <w:r>
+              <w:rPr>
+                <w:b w:val="0"/>
+                <w:sz w:val="16"/>
+              </w:rPr>
+              <w:t>白板上写一个大写 S 和小写 s："What's this?"（孩子会答字母名 S）→ "Good! That's its name. What sound does it make? Sss… like a snake."（做蛇的手势）再举第二张 "t"："And this one? What sound?" 最后举词卡 "cat"："Who can read this?"（有孩子试拼就请他上来，全班鼓掌）</w:t>
+            </w:r>
+          </w:p>
+        </w:tc>
+        <w:tc>
+          <w:tcPr>
+            <w:tcW w:type="dxa" w:w="2041"/>
+          </w:tcPr>
+          <w:p>
+            <w:pPr>
+              <w:spacing w:after="0" w:line="252" w:lineRule="auto"/>
+            </w:pPr>
+            <w:r/>
+            <w:r>
+              <w:rPr>
+                <w:b w:val="0"/>
+                <w:sz w:val="16"/>
+              </w:rPr>
+              <w:t>S！/ sss / 摇头；个别孩子可能拼出 cat</w:t>
+            </w:r>
+          </w:p>
+        </w:tc>
+        <w:tc>
+          <w:tcPr>
+            <w:tcW w:type="dxa" w:w="2608"/>
+          </w:tcPr>
+          <w:p>
+            <w:pPr>
+              <w:spacing w:after="0" w:line="252" w:lineRule="auto"/>
+            </w:pPr>
+            <w:r/>
+            <w:r>
+              <w:rPr>
+                <w:b w:val="0"/>
+                <w:color w:val="8A5A00"/>
+                <w:sz w:val="16"/>
+              </w:rPr>
+              <w:t>※ 探针 6（最关键）：区分"只认字母名"和"知道字母音 / 已接触拼读"。能说 /s/ /t/ 的孩子有自然拼读基础；能读 cat 的直接是 B 版对象。</w:t>
+            </w:r>
+          </w:p>
+          <w:p>
+            <w:pPr>
+              <w:spacing w:after="0" w:line="252" w:lineRule="auto"/>
+            </w:pPr>
+            <w:r>
+              <w:rPr>
+                <w:b w:val="0"/>
+                <w:color w:val="8A5A00"/>
+                <w:sz w:val="16"/>
+              </w:rPr>
+              <w:t>※ 这一步同时是 Phonics 环节的预告，不算跑题</w:t>
+            </w:r>
+          </w:p>
+        </w:tc>
+      </w:tr>
+    </w:tbl>
+    <w:p>
+      <w:pPr>
+        <w:spacing w:after="40"/>
+      </w:pPr>
+    </w:p>
+    <w:p>
+      <w:pPr>
+        <w:spacing w:before="160" w:after="40"/>
+      </w:pPr>
+      <w:r>
+        <w:rPr>
+          <w:b/>
+          <w:color w:val="1F5F9E"/>
+          <w:sz w:val="24"/>
+        </w:rPr>
+        <w:t>①-附　开场分级观察表（老师手持，打勾即可）</w:t>
+      </w:r>
+    </w:p>
+    <w:p>
+      <w:pPr>
+        <w:spacing w:after="60" w:before="0"/>
+      </w:pPr>
+      <w:r>
+        <w:rPr>
+          <w:b w:val="0"/>
+          <w:i w:val="0"/>
+          <w:sz w:val="19"/>
+        </w:rPr>
+        <w:t>打印 1 张，横向写孩子名字，纵向 6 个探针，每格打 ✓（做到）/ △（部分）/ ✗（没反应）。✓=2 分，△=1 分，✗=0 分，满分 12。</w:t>
+      </w:r>
+    </w:p>
+    <w:tbl>
+      <w:tblPr>
+        <w:tblStyle w:val="TableGrid"/>
+        <w:tblW w:type="auto" w:w="0"/>
+        <w:tblLayout w:type="fixed"/>
+        <w:tblLook w:firstColumn="1" w:firstRow="1" w:lastColumn="0" w:lastRow="0" w:noHBand="0" w:noVBand="1" w:val="04A0"/>
+      </w:tblPr>
+      <w:tblGrid>
+        <w:gridCol w:w="2494"/>
+        <w:gridCol w:w="2494"/>
+        <w:gridCol w:w="2494"/>
+        <w:gridCol w:w="2494"/>
+      </w:tblGrid>
+      <w:tr>
+        <w:trPr>
+          <w:tblHeader w:val="true"/>
+        </w:trPr>
+        <w:tc>
+          <w:tcPr>
+            <w:tcW w:type="dxa" w:w="2948"/>
+            <w:shd w:val="clear" w:color="auto" w:fill="DCE6F1"/>
+          </w:tcPr>
+          <w:p>
+            <w:pPr>
+              <w:spacing w:after="0" w:line="252" w:lineRule="auto"/>
+            </w:pPr>
+            <w:r/>
+            <w:r>
+              <w:rPr>
+                <w:b/>
                 <w:sz w:val="17"/>
               </w:rPr>
-              <w:t>※ 全课唯一的中文规则</w:t>
+              <w:t>探针</w:t>
+            </w:r>
+          </w:p>
+        </w:tc>
+        <w:tc>
+          <w:tcPr>
+            <w:tcW w:type="dxa" w:w="2608"/>
+            <w:shd w:val="clear" w:color="auto" w:fill="DCE6F1"/>
+          </w:tcPr>
+          <w:p>
+            <w:pPr>
+              <w:spacing w:after="0" w:line="252" w:lineRule="auto"/>
+            </w:pPr>
+            <w:r/>
+            <w:r>
+              <w:rPr>
+                <w:b/>
+                <w:sz w:val="17"/>
+              </w:rPr>
+              <w:t>✓ 2 分</w:t>
+            </w:r>
+          </w:p>
+        </w:tc>
+        <w:tc>
+          <w:tcPr>
+            <w:tcW w:type="dxa" w:w="2381"/>
+            <w:shd w:val="clear" w:color="auto" w:fill="DCE6F1"/>
+          </w:tcPr>
+          <w:p>
+            <w:pPr>
+              <w:spacing w:after="0" w:line="252" w:lineRule="auto"/>
+            </w:pPr>
+            <w:r/>
+            <w:r>
+              <w:rPr>
+                <w:b/>
+                <w:sz w:val="17"/>
+              </w:rPr>
+              <w:t>△ 1 分</w:t>
+            </w:r>
+          </w:p>
+        </w:tc>
+        <w:tc>
+          <w:tcPr>
+            <w:tcW w:type="dxa" w:w="2041"/>
+            <w:shd w:val="clear" w:color="auto" w:fill="DCE6F1"/>
+          </w:tcPr>
+          <w:p>
+            <w:pPr>
+              <w:spacing w:after="0" w:line="252" w:lineRule="auto"/>
+            </w:pPr>
+            <w:r/>
+            <w:r>
+              <w:rPr>
+                <w:b/>
+                <w:sz w:val="17"/>
+              </w:rPr>
+              <w:t>✗ 0 分</w:t>
+            </w:r>
+          </w:p>
+        </w:tc>
+      </w:tr>
+      <w:tr>
+        <w:tc>
+          <w:tcPr>
+            <w:tcW w:type="dxa" w:w="2948"/>
+          </w:tcPr>
+          <w:p>
+            <w:pPr>
+              <w:spacing w:after="0" w:line="252" w:lineRule="auto"/>
+            </w:pPr>
+            <w:r/>
+            <w:r>
+              <w:rPr>
+                <w:b w:val="0"/>
+                <w:sz w:val="17"/>
+              </w:rPr>
+              <w:t>P1 名字</w:t>
+            </w:r>
+          </w:p>
+        </w:tc>
+        <w:tc>
+          <w:tcPr>
+            <w:tcW w:type="dxa" w:w="2608"/>
+          </w:tcPr>
+          <w:p>
+            <w:pPr>
+              <w:spacing w:after="0" w:line="252" w:lineRule="auto"/>
+            </w:pPr>
+            <w:r/>
+            <w:r>
+              <w:rPr>
+                <w:b w:val="0"/>
+                <w:sz w:val="17"/>
+              </w:rPr>
+              <w:t>I'm ___. 整句</w:t>
+            </w:r>
+          </w:p>
+        </w:tc>
+        <w:tc>
+          <w:tcPr>
+            <w:tcW w:type="dxa" w:w="2381"/>
+          </w:tcPr>
+          <w:p>
+            <w:pPr>
+              <w:spacing w:after="0" w:line="252" w:lineRule="auto"/>
+            </w:pPr>
+            <w:r/>
+            <w:r>
+              <w:rPr>
+                <w:b w:val="0"/>
+                <w:sz w:val="17"/>
+              </w:rPr>
+              <w:t>只说名字</w:t>
+            </w:r>
+          </w:p>
+        </w:tc>
+        <w:tc>
+          <w:tcPr>
+            <w:tcW w:type="dxa" w:w="2041"/>
+          </w:tcPr>
+          <w:p>
+            <w:pPr>
+              <w:spacing w:after="0" w:line="252" w:lineRule="auto"/>
+            </w:pPr>
+            <w:r/>
+            <w:r>
+              <w:rPr>
+                <w:b w:val="0"/>
+                <w:sz w:val="17"/>
+              </w:rPr>
+              <w:t>不开口</w:t>
+            </w:r>
+          </w:p>
+        </w:tc>
+      </w:tr>
+      <w:tr>
+        <w:tc>
+          <w:tcPr>
+            <w:tcW w:type="dxa" w:w="2948"/>
+          </w:tcPr>
+          <w:p>
+            <w:pPr>
+              <w:spacing w:after="0" w:line="252" w:lineRule="auto"/>
+            </w:pPr>
+            <w:r/>
+            <w:r>
+              <w:rPr>
+                <w:b w:val="0"/>
+                <w:sz w:val="17"/>
+              </w:rPr>
+              <w:t>P2 年龄</w:t>
+            </w:r>
+          </w:p>
+        </w:tc>
+        <w:tc>
+          <w:tcPr>
+            <w:tcW w:type="dxa" w:w="2608"/>
+          </w:tcPr>
+          <w:p>
+            <w:pPr>
+              <w:spacing w:after="0" w:line="252" w:lineRule="auto"/>
+            </w:pPr>
+            <w:r/>
+            <w:r>
+              <w:rPr>
+                <w:b w:val="0"/>
+                <w:sz w:val="17"/>
+              </w:rPr>
+              <w:t>I'm six. 整句</w:t>
+            </w:r>
+          </w:p>
+        </w:tc>
+        <w:tc>
+          <w:tcPr>
+            <w:tcW w:type="dxa" w:w="2381"/>
+          </w:tcPr>
+          <w:p>
+            <w:pPr>
+              <w:spacing w:after="0" w:line="252" w:lineRule="auto"/>
+            </w:pPr>
+            <w:r/>
+            <w:r>
+              <w:rPr>
+                <w:b w:val="0"/>
+                <w:sz w:val="17"/>
+              </w:rPr>
+              <w:t>Six / 举手指</w:t>
+            </w:r>
+          </w:p>
+        </w:tc>
+        <w:tc>
+          <w:tcPr>
+            <w:tcW w:type="dxa" w:w="2041"/>
+          </w:tcPr>
+          <w:p>
+            <w:pPr>
+              <w:spacing w:after="0" w:line="252" w:lineRule="auto"/>
+            </w:pPr>
+            <w:r/>
+            <w:r>
+              <w:rPr>
+                <w:b w:val="0"/>
+                <w:sz w:val="17"/>
+              </w:rPr>
+              <w:t>不懂</w:t>
+            </w:r>
+          </w:p>
+        </w:tc>
+      </w:tr>
+      <w:tr>
+        <w:tc>
+          <w:tcPr>
+            <w:tcW w:type="dxa" w:w="2948"/>
+          </w:tcPr>
+          <w:p>
+            <w:pPr>
+              <w:spacing w:after="0" w:line="252" w:lineRule="auto"/>
+            </w:pPr>
+            <w:r/>
+            <w:r>
+              <w:rPr>
+                <w:b w:val="0"/>
+                <w:sz w:val="17"/>
+              </w:rPr>
+              <w:t>P3 追问 Do you like / What colour</w:t>
+            </w:r>
+          </w:p>
+        </w:tc>
+        <w:tc>
+          <w:tcPr>
+            <w:tcW w:type="dxa" w:w="2608"/>
+          </w:tcPr>
+          <w:p>
+            <w:pPr>
+              <w:spacing w:after="0" w:line="252" w:lineRule="auto"/>
+            </w:pPr>
+            <w:r/>
+            <w:r>
+              <w:rPr>
+                <w:b w:val="0"/>
+                <w:sz w:val="17"/>
+              </w:rPr>
+              <w:t>Yes! I like… / It's red. 或 Red!</w:t>
+            </w:r>
+          </w:p>
+        </w:tc>
+        <w:tc>
+          <w:tcPr>
+            <w:tcW w:type="dxa" w:w="2381"/>
+          </w:tcPr>
+          <w:p>
+            <w:pPr>
+              <w:spacing w:after="0" w:line="252" w:lineRule="auto"/>
+            </w:pPr>
+            <w:r/>
+            <w:r>
+              <w:rPr>
+                <w:b w:val="0"/>
+                <w:sz w:val="17"/>
+              </w:rPr>
+              <w:t>点头摇头、中文答</w:t>
+            </w:r>
+          </w:p>
+        </w:tc>
+        <w:tc>
+          <w:tcPr>
+            <w:tcW w:type="dxa" w:w="2041"/>
+          </w:tcPr>
+          <w:p>
+            <w:pPr>
+              <w:spacing w:after="0" w:line="252" w:lineRule="auto"/>
+            </w:pPr>
+            <w:r/>
+            <w:r>
+              <w:rPr>
+                <w:b w:val="0"/>
+                <w:sz w:val="17"/>
+              </w:rPr>
+              <w:t>无反应</w:t>
+            </w:r>
+          </w:p>
+        </w:tc>
+      </w:tr>
+      <w:tr>
+        <w:tc>
+          <w:tcPr>
+            <w:tcW w:type="dxa" w:w="2948"/>
+          </w:tcPr>
+          <w:p>
+            <w:pPr>
+              <w:spacing w:after="0" w:line="252" w:lineRule="auto"/>
+            </w:pPr>
+            <w:r/>
+            <w:r>
+              <w:rPr>
+                <w:b w:val="0"/>
+                <w:sz w:val="17"/>
+              </w:rPr>
+              <w:t>P4 不示范的指令 touch your nose / clap three times</w:t>
+            </w:r>
+          </w:p>
+        </w:tc>
+        <w:tc>
+          <w:tcPr>
+            <w:tcW w:type="dxa" w:w="2608"/>
+          </w:tcPr>
+          <w:p>
+            <w:pPr>
+              <w:spacing w:after="0" w:line="252" w:lineRule="auto"/>
+            </w:pPr>
+            <w:r/>
+            <w:r>
+              <w:rPr>
+                <w:b w:val="0"/>
+                <w:sz w:val="17"/>
+              </w:rPr>
+              <w:t>两条都只凭听做对</w:t>
+            </w:r>
+          </w:p>
+        </w:tc>
+        <w:tc>
+          <w:tcPr>
+            <w:tcW w:type="dxa" w:w="2381"/>
+          </w:tcPr>
+          <w:p>
+            <w:pPr>
+              <w:spacing w:after="0" w:line="252" w:lineRule="auto"/>
+            </w:pPr>
+            <w:r/>
+            <w:r>
+              <w:rPr>
+                <w:b w:val="0"/>
+                <w:sz w:val="17"/>
+              </w:rPr>
+              <w:t>一条对或看别人才做</w:t>
+            </w:r>
+          </w:p>
+        </w:tc>
+        <w:tc>
+          <w:tcPr>
+            <w:tcW w:type="dxa" w:w="2041"/>
+          </w:tcPr>
+          <w:p>
+            <w:pPr>
+              <w:spacing w:after="0" w:line="252" w:lineRule="auto"/>
+            </w:pPr>
+            <w:r/>
+            <w:r>
+              <w:rPr>
+                <w:b w:val="0"/>
+                <w:sz w:val="17"/>
+              </w:rPr>
+              <w:t>完全跟不上</w:t>
+            </w:r>
+          </w:p>
+        </w:tc>
+      </w:tr>
+      <w:tr>
+        <w:tc>
+          <w:tcPr>
+            <w:tcW w:type="dxa" w:w="2948"/>
+          </w:tcPr>
+          <w:p>
+            <w:pPr>
+              <w:spacing w:after="0" w:line="252" w:lineRule="auto"/>
+            </w:pPr>
+            <w:r/>
+            <w:r>
+              <w:rPr>
+                <w:b w:val="0"/>
+                <w:sz w:val="17"/>
+              </w:rPr>
+              <w:t>P5 四张图卡</w:t>
+            </w:r>
+          </w:p>
+        </w:tc>
+        <w:tc>
+          <w:tcPr>
+            <w:tcW w:type="dxa" w:w="2608"/>
+          </w:tcPr>
+          <w:p>
+            <w:pPr>
+              <w:spacing w:after="0" w:line="252" w:lineRule="auto"/>
+            </w:pPr>
+            <w:r/>
+            <w:r>
+              <w:rPr>
+                <w:b w:val="0"/>
+                <w:sz w:val="17"/>
+              </w:rPr>
+              <w:t>3 张以上会说，且至少 1 次整句 It's a ___.</w:t>
+            </w:r>
+          </w:p>
+        </w:tc>
+        <w:tc>
+          <w:tcPr>
+            <w:tcW w:type="dxa" w:w="2381"/>
+          </w:tcPr>
+          <w:p>
+            <w:pPr>
+              <w:spacing w:after="0" w:line="252" w:lineRule="auto"/>
+            </w:pPr>
+            <w:r/>
+            <w:r>
+              <w:rPr>
+                <w:b w:val="0"/>
+                <w:sz w:val="17"/>
+              </w:rPr>
+              <w:t>说出 1–2 个词</w:t>
+            </w:r>
+          </w:p>
+        </w:tc>
+        <w:tc>
+          <w:tcPr>
+            <w:tcW w:type="dxa" w:w="2041"/>
+          </w:tcPr>
+          <w:p>
+            <w:pPr>
+              <w:spacing w:after="0" w:line="252" w:lineRule="auto"/>
+            </w:pPr>
+            <w:r/>
+            <w:r>
+              <w:rPr>
+                <w:b w:val="0"/>
+                <w:sz w:val="17"/>
+              </w:rPr>
+              <w:t>一个都不会</w:t>
+            </w:r>
+          </w:p>
+        </w:tc>
+      </w:tr>
+      <w:tr>
+        <w:tc>
+          <w:tcPr>
+            <w:tcW w:type="dxa" w:w="2948"/>
+          </w:tcPr>
+          <w:p>
+            <w:pPr>
+              <w:spacing w:after="0" w:line="252" w:lineRule="auto"/>
+            </w:pPr>
+            <w:r/>
+            <w:r>
+              <w:rPr>
+                <w:b w:val="0"/>
+                <w:sz w:val="17"/>
+              </w:rPr>
+              <w:t>P6 字母音 / 拼读</w:t>
+            </w:r>
+          </w:p>
+        </w:tc>
+        <w:tc>
+          <w:tcPr>
+            <w:tcW w:type="dxa" w:w="2608"/>
+          </w:tcPr>
+          <w:p>
+            <w:pPr>
+              <w:spacing w:after="0" w:line="252" w:lineRule="auto"/>
+            </w:pPr>
+            <w:r/>
+            <w:r>
+              <w:rPr>
+                <w:b w:val="0"/>
+                <w:sz w:val="17"/>
+              </w:rPr>
+              <w:t>能说 /s/ /t/ 的音，或试着拼 cat</w:t>
+            </w:r>
+          </w:p>
+        </w:tc>
+        <w:tc>
+          <w:tcPr>
+            <w:tcW w:type="dxa" w:w="2381"/>
+          </w:tcPr>
+          <w:p>
+            <w:pPr>
+              <w:spacing w:after="0" w:line="252" w:lineRule="auto"/>
+            </w:pPr>
+            <w:r/>
+            <w:r>
+              <w:rPr>
+                <w:b w:val="0"/>
+                <w:sz w:val="17"/>
+              </w:rPr>
+              <w:t>只说字母名 S、T</w:t>
+            </w:r>
+          </w:p>
+        </w:tc>
+        <w:tc>
+          <w:tcPr>
+            <w:tcW w:type="dxa" w:w="2041"/>
+          </w:tcPr>
+          <w:p>
+            <w:pPr>
+              <w:spacing w:after="0" w:line="252" w:lineRule="auto"/>
+            </w:pPr>
+            <w:r/>
+            <w:r>
+              <w:rPr>
+                <w:b w:val="0"/>
+                <w:sz w:val="17"/>
+              </w:rPr>
+              <w:t>对字母也不确定</w:t>
+            </w:r>
+          </w:p>
+        </w:tc>
+      </w:tr>
+    </w:tbl>
+    <w:p>
+      <w:pPr>
+        <w:spacing w:after="40"/>
+      </w:pPr>
+    </w:p>
+    <w:tbl>
+      <w:tblPr>
+        <w:tblStyle w:val="TableGrid"/>
+        <w:tblW w:type="auto" w:w="0"/>
+        <w:tblLayout w:type="fixed"/>
+        <w:tblLook w:firstColumn="1" w:firstRow="1" w:lastColumn="0" w:lastRow="0" w:noHBand="0" w:noVBand="1" w:val="04A0"/>
+      </w:tblPr>
+      <w:tblGrid>
+        <w:gridCol w:w="3326"/>
+        <w:gridCol w:w="3326"/>
+        <w:gridCol w:w="3326"/>
+      </w:tblGrid>
+      <w:tr>
+        <w:trPr>
+          <w:tblHeader w:val="true"/>
+        </w:trPr>
+        <w:tc>
+          <w:tcPr>
+            <w:tcW w:type="dxa" w:w="3402"/>
+            <w:shd w:val="clear" w:color="auto" w:fill="DCE6F1"/>
+          </w:tcPr>
+          <w:p>
+            <w:pPr>
+              <w:spacing w:after="0" w:line="252" w:lineRule="auto"/>
+            </w:pPr>
+            <w:r/>
+            <w:r>
+              <w:rPr>
+                <w:b/>
+                <w:sz w:val="17"/>
+              </w:rPr>
+              <w:t>班级总体判断</w:t>
+            </w:r>
+          </w:p>
+        </w:tc>
+        <w:tc>
+          <w:tcPr>
+            <w:tcW w:type="dxa" w:w="2041"/>
+            <w:shd w:val="clear" w:color="auto" w:fill="DCE6F1"/>
+          </w:tcPr>
+          <w:p>
+            <w:pPr>
+              <w:spacing w:after="0" w:line="252" w:lineRule="auto"/>
+            </w:pPr>
+            <w:r/>
+            <w:r>
+              <w:rPr>
+                <w:b/>
+                <w:sz w:val="17"/>
+              </w:rPr>
+              <w:t>走哪一版</w:t>
+            </w:r>
+          </w:p>
+        </w:tc>
+        <w:tc>
+          <w:tcPr>
+            <w:tcW w:type="dxa" w:w="4535"/>
+            <w:shd w:val="clear" w:color="auto" w:fill="DCE6F1"/>
+          </w:tcPr>
+          <w:p>
+            <w:pPr>
+              <w:spacing w:after="0" w:line="252" w:lineRule="auto"/>
+            </w:pPr>
+            <w:r/>
+            <w:r>
+              <w:rPr>
+                <w:b/>
+                <w:sz w:val="17"/>
+              </w:rPr>
+              <w:t>怎么执行</w:t>
+            </w:r>
+          </w:p>
+        </w:tc>
+      </w:tr>
+      <w:tr>
+        <w:tc>
+          <w:tcPr>
+            <w:tcW w:type="dxa" w:w="3402"/>
+          </w:tcPr>
+          <w:p>
+            <w:pPr>
+              <w:spacing w:after="0" w:line="252" w:lineRule="auto"/>
+            </w:pPr>
+            <w:r/>
+            <w:r>
+              <w:rPr>
+                <w:b w:val="0"/>
+                <w:sz w:val="17"/>
+              </w:rPr>
+              <w:t>一半以上孩子 ≥ 8 分，且至少 2 人 P6 得 2 分</w:t>
+            </w:r>
+          </w:p>
+        </w:tc>
+        <w:tc>
+          <w:tcPr>
+            <w:tcW w:type="dxa" w:w="2041"/>
+          </w:tcPr>
+          <w:p>
+            <w:pPr>
+              <w:spacing w:after="0" w:line="252" w:lineRule="auto"/>
+            </w:pPr>
+            <w:r/>
+            <w:r>
+              <w:rPr>
+                <w:b w:val="0"/>
+                <w:sz w:val="17"/>
+              </w:rPr>
+              <w:t>B · Level 1 版全程</w:t>
+            </w:r>
+          </w:p>
+        </w:tc>
+        <w:tc>
+          <w:tcPr>
+            <w:tcW w:type="dxa" w:w="4535"/>
+          </w:tcPr>
+          <w:p>
+            <w:pPr>
+              <w:spacing w:after="0" w:line="252" w:lineRule="auto"/>
+            </w:pPr>
+            <w:r/>
+            <w:r>
+              <w:rPr>
+                <w:b w:val="0"/>
+                <w:sz w:val="17"/>
+              </w:rPr>
+              <w:t>按 B 版备课走；P6 得 2 分的孩子在 ④ 环节做"小老师"</w:t>
+            </w:r>
+          </w:p>
+        </w:tc>
+      </w:tr>
+      <w:tr>
+        <w:tc>
+          <w:tcPr>
+            <w:tcW w:type="dxa" w:w="3402"/>
+          </w:tcPr>
+          <w:p>
+            <w:pPr>
+              <w:spacing w:after="0" w:line="252" w:lineRule="auto"/>
+            </w:pPr>
+            <w:r/>
+            <w:r>
+              <w:rPr>
+                <w:b w:val="0"/>
+                <w:sz w:val="17"/>
+              </w:rPr>
+              <w:t>多数孩子 5–7 分（会答名字年龄、词汇有一点、但 P3/P4/P6 多为 △）</w:t>
+            </w:r>
+          </w:p>
+        </w:tc>
+        <w:tc>
+          <w:tcPr>
+            <w:tcW w:type="dxa" w:w="2041"/>
+          </w:tcPr>
+          <w:p>
+            <w:pPr>
+              <w:spacing w:after="0" w:line="252" w:lineRule="auto"/>
+            </w:pPr>
+            <w:r/>
+            <w:r>
+              <w:rPr>
+                <w:b w:val="0"/>
+                <w:sz w:val="17"/>
+              </w:rPr>
+              <w:t>B 版主体 + A 版兜底</w:t>
+            </w:r>
+          </w:p>
+        </w:tc>
+        <w:tc>
+          <w:tcPr>
+            <w:tcW w:type="dxa" w:w="4535"/>
+          </w:tcPr>
+          <w:p>
+            <w:pPr>
+              <w:spacing w:after="0" w:line="252" w:lineRule="auto"/>
+            </w:pPr>
+            <w:r/>
+            <w:r>
+              <w:rPr>
+                <w:b w:val="0"/>
+                <w:sz w:val="17"/>
+              </w:rPr>
+              <w:t>② ③ 按 B 版；④ Phonics 先做 A 版的 Bb/Tt 首音分拣 4 分钟，再升级到合成 top——合成只要求全班齐拼，个别读由自愿者来</w:t>
+            </w:r>
+          </w:p>
+        </w:tc>
+      </w:tr>
+      <w:tr>
+        <w:tc>
+          <w:tcPr>
+            <w:tcW w:type="dxa" w:w="3402"/>
+          </w:tcPr>
+          <w:p>
+            <w:pPr>
+              <w:spacing w:after="0" w:line="252" w:lineRule="auto"/>
+            </w:pPr>
+            <w:r/>
+            <w:r>
+              <w:rPr>
+                <w:b w:val="0"/>
+                <w:sz w:val="17"/>
+              </w:rPr>
+              <w:t>一半以上孩子 ≤ 4 分（P1 P2 以外几乎没有反应）</w:t>
+            </w:r>
+          </w:p>
+        </w:tc>
+        <w:tc>
+          <w:tcPr>
+            <w:tcW w:type="dxa" w:w="2041"/>
+          </w:tcPr>
+          <w:p>
+            <w:pPr>
+              <w:spacing w:after="0" w:line="252" w:lineRule="auto"/>
+            </w:pPr>
+            <w:r/>
+            <w:r>
+              <w:rPr>
+                <w:b w:val="0"/>
+                <w:sz w:val="17"/>
+              </w:rPr>
+              <w:t>A · Starter 版全程</w:t>
+            </w:r>
+          </w:p>
+        </w:tc>
+        <w:tc>
+          <w:tcPr>
+            <w:tcW w:type="dxa" w:w="4535"/>
+          </w:tcPr>
+          <w:p>
+            <w:pPr>
+              <w:spacing w:after="0" w:line="252" w:lineRule="auto"/>
+            </w:pPr>
+            <w:r/>
+            <w:r>
+              <w:rPr>
+                <w:b w:val="0"/>
+                <w:sz w:val="17"/>
+              </w:rPr>
+              <w:t>按 A 版；③ 问答只要求 It's a ___.，不做 Is it a…? 的 No, it isn't.</w:t>
+            </w:r>
+          </w:p>
+        </w:tc>
+      </w:tr>
+      <w:tr>
+        <w:tc>
+          <w:tcPr>
+            <w:tcW w:type="dxa" w:w="3402"/>
+          </w:tcPr>
+          <w:p>
+            <w:pPr>
+              <w:spacing w:after="0" w:line="252" w:lineRule="auto"/>
+            </w:pPr>
+            <w:r/>
+            <w:r>
+              <w:rPr>
+                <w:b w:val="0"/>
+                <w:sz w:val="17"/>
+              </w:rPr>
+              <w:t>班内差异很大（既有 ≥10 又有 ≤3）</w:t>
+            </w:r>
+          </w:p>
+        </w:tc>
+        <w:tc>
+          <w:tcPr>
+            <w:tcW w:type="dxa" w:w="2041"/>
+          </w:tcPr>
+          <w:p>
+            <w:pPr>
+              <w:spacing w:after="0" w:line="252" w:lineRule="auto"/>
+            </w:pPr>
+            <w:r/>
+            <w:r>
+              <w:rPr>
+                <w:b w:val="0"/>
+                <w:sz w:val="17"/>
+              </w:rPr>
+              <w:t>A 版流程 + B 版挑战档</w:t>
+            </w:r>
+          </w:p>
+        </w:tc>
+        <w:tc>
+          <w:tcPr>
+            <w:tcW w:type="dxa" w:w="4535"/>
+          </w:tcPr>
+          <w:p>
+            <w:pPr>
+              <w:spacing w:after="0" w:line="252" w:lineRule="auto"/>
+            </w:pPr>
+            <w:r/>
+            <w:r>
+              <w:rPr>
+                <w:b w:val="0"/>
+                <w:sz w:val="17"/>
+              </w:rPr>
+              <w:t>用 A 版流程保证所有人参与；每个产出环节给高分孩子"挑战档"任务（见"七、分层与应急"）；课后分别与两类家长沟通分班建议</w:t>
+            </w:r>
+          </w:p>
+        </w:tc>
+      </w:tr>
+    </w:tbl>
+    <w:p>
+      <w:pPr>
+        <w:spacing w:after="40"/>
+      </w:pPr>
+    </w:p>
+    <w:tbl>
+      <w:tblPr>
+        <w:tblStyle w:val="TableGrid"/>
+        <w:tblW w:type="auto" w:w="0"/>
+        <w:tblLook w:firstColumn="1" w:firstRow="1" w:lastColumn="0" w:lastRow="0" w:noHBand="0" w:noVBand="1" w:val="04A0"/>
+      </w:tblPr>
+      <w:tblGrid>
+        <w:gridCol w:w="9978"/>
+      </w:tblGrid>
+      <w:tr>
+        <w:tc>
+          <w:tcPr>
+            <w:tcW w:type="dxa" w:w="9978"/>
+            <w:shd w:val="clear" w:color="auto" w:fill="FFF9E6"/>
+          </w:tcPr>
+          <w:p>
+            <w:r/>
+            <w:r>
+              <w:rPr>
+                <w:b/>
+                <w:sz w:val="20"/>
+              </w:rPr>
+              <w:t>课前 2 分钟补充探针（可选，孩子陆续到场时在门口做）</w:t>
+            </w:r>
+          </w:p>
+          <w:p>
+            <w:pPr>
+              <w:spacing w:after="20"/>
+            </w:pPr>
+            <w:r>
+              <w:rPr>
+                <w:sz w:val="19"/>
+              </w:rPr>
+              <w:t>孩子进门时老师蹲下，用英文只做三件事，总共 20 秒：① "Hello! What's your name?" ② 举一张图卡 "What is it?" ③ 举字母卡 "What sound?"。记在观察表角落。这样正式开场前就已经有了初步印象，课中 7 分钟是复核。</w:t>
+            </w:r>
+          </w:p>
+          <w:p>
+            <w:pPr>
+              <w:spacing w:after="20"/>
+            </w:pPr>
+            <w:r>
+              <w:rPr>
+                <w:sz w:val="19"/>
+              </w:rPr>
+              <w:t>报名时请家长在微信回答三题（1 分钟）：孩子上过英语课/外教课吗？大约多久？能不能说完整句子（如 I like apples）？认识字母的"声音"吗（如 b 发 /b/）？——三题都"是"的孩子基本是 B 版对象。</w:t>
+            </w:r>
+          </w:p>
+          <w:p>
+            <w:pPr>
+              <w:spacing w:after="20"/>
+            </w:pPr>
+            <w:r>
+              <w:rPr>
+                <w:sz w:val="19"/>
+              </w:rPr>
+              <w:t>观察表不给家长看，但课后 3 分钟可以引用："今天我观察到孩子能听懂没示范过的指令、能说出字母的声音，这说明他适合直接进 Level 1。"——家长会觉得分级是有依据的，而不是按年龄一刀切。</w:t>
             </w:r>
           </w:p>
         </w:tc>
@@ -2405,7 +3621,7 @@
           <w:color w:val="C0504D"/>
           <w:sz w:val="24"/>
         </w:rPr>
-        <w:t>② Toy Shop 开张：6 个玩具词（5–15 分钟）</w:t>
+        <w:t>② Toy Shop 开张：6 个玩具词（7–15 分钟）</w:t>
       </w:r>
     </w:p>
     <w:tbl>
@@ -2536,7 +3752,7 @@
                 <w:b w:val="0"/>
                 <w:sz w:val="17"/>
               </w:rPr>
-              <w:t>指着盖布的桌子："This is Bobo's Toy Shop. What's in the shop?" 慢慢掀布一角</w:t>
+              <w:t>指着盖布的桌子："This is Momo's Toy Shop. What's in the shop?" 慢慢掀布一角</w:t>
             </w:r>
           </w:p>
         </w:tc>
@@ -2648,7 +3864,7 @@
                 <w:color w:val="8A5A00"/>
                 <w:sz w:val="17"/>
               </w:rPr>
-              <w:t>※ 顺序：ball → top（转一下，尖叫；/t/ 伏笔）→ drum（敲一下）→ kite（举高放风筝）→ robot（机器人走路）→ puppet（举起 Bobo："Bobo is a puppet!"；/p/ 伏笔）</w:t>
+              <w:t>※ 顺序：ball → top（转一下，尖叫；/t/ 伏笔）→ drum（敲一下）→ kite（举高放风筝）→ robot（机器人走路）→ puppet（举起 Momo："Momo is a puppet!"；/p/ 伏笔）</w:t>
             </w:r>
           </w:p>
         </w:tc>
@@ -2686,7 +3902,7 @@
                 <w:b w:val="0"/>
                 <w:sz w:val="17"/>
               </w:rPr>
-              <w:t>"Close your eyes!" 藏 1 个 → "Open! What's missing?" 3 轮，第 3 轮藏 2 个</w:t>
+              <w:t>"Close your eyes!" 藏 1 个 → "Open! What's missing?" 2 轮，第 2 轮藏 2 个（① 多用了 2 分钟，这里补回）</w:t>
             </w:r>
           </w:p>
         </w:tc>
@@ -2950,7 +4166,7 @@
                 <w:b w:val="0"/>
                 <w:sz w:val="17"/>
               </w:rPr>
-              <w:t>老师当顾客走到店前，Bobo 当店员："Do you want a ball?" 老师："Yes, I do!"（点头，接过球，付纸币）再来："Do you want a drum?" 老师："No, I don't. I want a top."（摇头，指陀螺）示范 4 轮，动作夸张。然后带全班跟说三句各 3 遍，配手势：Yes, I do（点头 + 伸手）/ No, I don't（摇头 + 手摆）/ I want a…（手指）</w:t>
+              <w:t>老师当顾客走到店前，Momo 当店员："Do you want a ball?" 老师："Yes, I do!"（点头，接过球，付纸币）再来："Do you want a drum?" 老师："No, I don't. I want a top."（摇头，指陀螺）示范 4 轮，动作夸张。然后带全班跟说三句各 3 遍，配手势：Yes, I do（点头 + 伸手）/ No, I don't（摇头 + 手摆）/ I want a…（手指）</w:t>
             </w:r>
           </w:p>
         </w:tc>
@@ -3025,7 +4241,7 @@
                 <w:b w:val="0"/>
                 <w:sz w:val="17"/>
               </w:rPr>
-              <w:t>Bobo 举玩具问全班 "Do you want a robot?" 全班按真实想法答 Yes, I do! 或 No, I don't.；老师数人数 "Three yes, four no!" 6 轮</w:t>
+              <w:t>Momo 举玩具问全班 "Do you want a robot?" 全班按真实想法答 Yes, I do! 或 No, I don't.；老师数人数 "Three yes, four no!" 6 轮</w:t>
             </w:r>
           </w:p>
         </w:tc>
@@ -3100,7 +4316,7 @@
                 <w:b w:val="0"/>
                 <w:sz w:val="17"/>
               </w:rPr>
-              <w:t>孩子排队当顾客，Bobo（老师）问 "Do you want a ___?" 孩子答；若 No 则必须说 I want a ___.；付钱拿玩具坐回去。全班每轮一起说 "Yes, I do!" 或 "No!"</w:t>
+              <w:t>孩子排队当顾客，Momo（老师）问 "Do you want a ___?" 孩子答；若 No 则必须说 I want a ___.；付钱拿玩具坐回去。全班每轮一起说 "Yes, I do!" 或 "No!"</w:t>
             </w:r>
           </w:p>
         </w:tc>
@@ -3137,7 +4353,7 @@
                 <w:color w:val="8A5A00"/>
                 <w:sz w:val="17"/>
               </w:rPr>
-              <w:t>※ 挑战档：请能力强的孩子当店员拿着 Bobo 问下一位 "Do you want a…?"——每人至少当 1 次顾客，3–4 个孩子当过店员</w:t>
+              <w:t>※ 挑战档：请能力强的孩子当店员拿着 Momo 问下一位 "Do you want a…?"——每人至少当 1 次顾客，3–4 个孩子当过店员</w:t>
             </w:r>
           </w:p>
         </w:tc>
@@ -4694,7 +5910,7 @@
                 <w:b w:val="0"/>
                 <w:sz w:val="17"/>
               </w:rPr>
-              <w:t>Bobo 击掌 "Goodbye, ___!"</w:t>
+              <w:t>Momo 击掌 "Goodbye, ___!"</w:t>
             </w:r>
           </w:p>
         </w:tc>
@@ -4712,7 +5928,7 @@
                 <w:b w:val="0"/>
                 <w:sz w:val="17"/>
               </w:rPr>
-              <w:t>Goodbye, Bobo!</w:t>
+              <w:t>Goodbye, Momo!</w:t>
             </w:r>
           </w:p>
         </w:tc>
@@ -5023,7 +6239,7 @@
                 <w:b w:val="0"/>
                 <w:sz w:val="18"/>
               </w:rPr>
-              <w:t>给动作任务：放磁性字母、翻书、给 Bobo 递玩具；展示环节老师和他一起读</w:t>
+              <w:t>给动作任务：放磁性字母、翻书、给 Momo 递玩具；展示环节老师和他一起读</w:t>
             </w:r>
           </w:p>
         </w:tc>
@@ -5444,7 +6660,7 @@
                 <w:b w:val="0"/>
                 <w:sz w:val="18"/>
               </w:rPr>
-              <w:t>课上 5 分钟内的观察（Hello 环节）</w:t>
+              <w:t>开场 7 分钟分级观察表（① 环节 6 个探针，满分 12）</w:t>
             </w:r>
           </w:p>
         </w:tc>
@@ -5462,7 +6678,7 @@
                 <w:b w:val="0"/>
                 <w:sz w:val="18"/>
               </w:rPr>
-              <w:t>一半以上答不出名字或不敢开口</w:t>
+              <w:t>一半以上 ≤ 4 分；P3/P4/P6 几乎全 ✗</w:t>
             </w:r>
           </w:p>
         </w:tc>
@@ -5480,7 +6696,7 @@
                 <w:b w:val="0"/>
                 <w:sz w:val="18"/>
               </w:rPr>
-              <w:t>多数能答 I'm ___. I'm six.</w:t>
+              <w:t>一半以上 ≥ 8 分，且至少 2 人能说出字母音或试拼 cat</w:t>
             </w:r>
           </w:p>
         </w:tc>

</xml_diff>